<commit_message>
updates after Sauter review
</commit_message>
<xml_diff>
--- a/CV.docx
+++ b/CV.docx
@@ -272,16 +272,7 @@
         <w:t xml:space="preserve"> T</w:t>
       </w:r>
       <w:r>
-        <w:t>hesis</w:t>
-      </w:r>
-      <w:r>
-        <w:t xml:space="preserve"> research focused on spacecraft flywheel v</w:t>
-      </w:r>
-      <w:r>
-        <w:t>ibration</w:t>
-      </w:r>
-      <w:r>
-        <w:t xml:space="preserve">. </w:t>
+        <w:t xml:space="preserve">hesis research focused on spacecraft flywheel vibration. </w:t>
       </w:r>
     </w:p>
     <w:p>
@@ -319,6 +310,65 @@
         <w:pStyle w:val="Heading1"/>
       </w:pPr>
       <w:r>
+        <w:t>Military Education</w:t>
+      </w:r>
+    </w:p>
+    <w:p>
+      <w:pPr>
+        <w:tabs>
+          <w:tab w:val="left" w:pos="900"/>
+        </w:tabs>
+        <w:spacing w:after="0"/>
+      </w:pPr>
+      <w:r>
+        <w:t>Present</w:t>
+      </w:r>
+      <w:r>
+        <w:tab/>
+        <w:t>Air War College</w:t>
+      </w:r>
+      <w:r>
+        <w:t>, currently enrolled in</w:t>
+      </w:r>
+      <w:r>
+        <w:t xml:space="preserve"> distance learning</w:t>
+      </w:r>
+    </w:p>
+    <w:p>
+      <w:pPr>
+        <w:tabs>
+          <w:tab w:val="left" w:pos="900"/>
+        </w:tabs>
+        <w:spacing w:after="0"/>
+      </w:pPr>
+      <w:r>
+        <w:t>2017</w:t>
+      </w:r>
+      <w:r>
+        <w:tab/>
+        <w:t>Air Command and Staff College, completed via distance learning</w:t>
+      </w:r>
+    </w:p>
+    <w:p>
+      <w:pPr>
+        <w:tabs>
+          <w:tab w:val="left" w:pos="900"/>
+        </w:tabs>
+        <w:spacing w:after="0"/>
+      </w:pPr>
+      <w:r>
+        <w:t>2012</w:t>
+      </w:r>
+      <w:r>
+        <w:tab/>
+        <w:t>Squadron Officer School, completed in residence</w:t>
+      </w:r>
+    </w:p>
+    <w:p>
+      <w:pPr>
+        <w:pStyle w:val="Heading1"/>
+      </w:pPr>
+      <w:r>
         <w:t>Assignments</w:t>
       </w:r>
     </w:p>
@@ -339,32 +389,11 @@
         <w:spacing w:after="0"/>
       </w:pPr>
       <w:r>
-        <w:t>Jan</w:t>
-      </w:r>
-      <w:r>
-        <w:t>–Ma</w:t>
-      </w:r>
-      <w:r>
-        <w:t>y</w:t>
-      </w:r>
-      <w:r>
-        <w:t xml:space="preserve"> 2025</w:t>
+        <w:t>Jan–May 2025</w:t>
       </w:r>
       <w:r>
         <w:tab/>
-        <w:t xml:space="preserve">Acting </w:t>
-      </w:r>
-      <w:r>
-        <w:t xml:space="preserve">Cadet Squadron </w:t>
-      </w:r>
-      <w:r>
-        <w:t xml:space="preserve">Commander, </w:t>
-      </w:r>
-      <w:r>
-        <w:t>Cadet Group 4</w:t>
-      </w:r>
-      <w:r>
-        <w:t>, USAF Academy CO</w:t>
+        <w:t>Acting Cadet Squadron Commander, Cadet Group 4, USAF Academy CO</w:t>
       </w:r>
     </w:p>
     <w:p>
@@ -402,13 +431,7 @@
         <w:spacing w:after="0"/>
       </w:pPr>
       <w:r>
-        <w:t>2014</w:t>
-      </w:r>
-      <w:r>
-        <w:t>–</w:t>
-      </w:r>
-      <w:r>
-        <w:t>2016</w:t>
+        <w:t>2014–2016</w:t>
       </w:r>
       <w:r>
         <w:tab/>
@@ -420,28 +443,17 @@
         <w:spacing w:after="0"/>
       </w:pPr>
       <w:r>
-        <w:t>201</w:t>
-      </w:r>
-      <w:r>
-        <w:t>1</w:t>
-      </w:r>
-      <w:r>
-        <w:t>–2014</w:t>
+        <w:t>2011–2014</w:t>
       </w:r>
       <w:r>
         <w:tab/>
-      </w:r>
-      <w:r>
         <w:t xml:space="preserve">DSP Ops </w:t>
       </w:r>
       <w:r>
         <w:t>Officer,</w:t>
       </w:r>
       <w:r>
-        <w:t xml:space="preserve"> </w:t>
-      </w:r>
-      <w:r>
-        <w:t>SBIRS Sys Test Engineer, Infrared Space Systems Directorate, Los Angeles CA</w:t>
+        <w:t xml:space="preserve"> SBIRS Sys Test Engineer, Infrared Space Systems Directorate, Los Angeles CA</w:t>
       </w:r>
     </w:p>
     <w:p>
@@ -449,13 +461,7 @@
         <w:spacing w:after="0"/>
       </w:pPr>
       <w:r>
-        <w:t>2009</w:t>
-      </w:r>
-      <w:r>
-        <w:t>–</w:t>
-      </w:r>
-      <w:r>
-        <w:t>2011</w:t>
+        <w:t>2009–2011</w:t>
       </w:r>
       <w:r>
         <w:tab/>
@@ -467,13 +473,7 @@
         <w:spacing w:after="0"/>
       </w:pPr>
       <w:r>
-        <w:t>2008</w:t>
-      </w:r>
-      <w:r>
-        <w:t>–</w:t>
-      </w:r>
-      <w:r>
-        <w:t>2009</w:t>
+        <w:t>2008–2009</w:t>
       </w:r>
       <w:r>
         <w:tab/>
@@ -641,10 +641,7 @@
         <w:t xml:space="preserve">ibrary, which connected program staff </w:t>
       </w:r>
       <w:r>
-        <w:t>to intelligence authors</w:t>
-      </w:r>
-      <w:r>
-        <w:t xml:space="preserve"> </w:t>
+        <w:t xml:space="preserve">to intelligence authors </w:t>
       </w:r>
       <w:r>
         <w:t>for $1.23T worth of defense programs</w:t>
@@ -696,10 +693,7 @@
         <w:t>Taught spring semester sophomore ROTC leadership</w:t>
       </w:r>
       <w:r>
-        <w:t xml:space="preserve"> </w:t>
-      </w:r>
-      <w:r>
-        <w:t>Team &amp; Leadership Fundamentals</w:t>
+        <w:t xml:space="preserve"> Team &amp; Leadership Fundamentals</w:t>
       </w:r>
       <w:r>
         <w:t xml:space="preserve"> </w:t>
@@ -798,10 +792,7 @@
         <w:t>subsystems</w:t>
       </w:r>
       <w:r>
-        <w:t xml:space="preserve"> through assembly and operation of a </w:t>
-      </w:r>
-      <w:r>
-        <w:t>breadboard-based spacecraft analog</w:t>
+        <w:t xml:space="preserve"> through assembly and operation of a breadboard-based spacecraft analog</w:t>
       </w:r>
       <w:r>
         <w:t xml:space="preserve">. Transitioned lab curriculum to </w:t>
@@ -842,10 +833,13 @@
         <w:t xml:space="preserve"> &amp;</w:t>
       </w:r>
       <w:r>
-        <w:t xml:space="preserve"> Tech.</w:t>
-      </w:r>
-      <w:r>
-        <w:t xml:space="preserve"> Comm</w:t>
+        <w:t xml:space="preserve"> </w:t>
+      </w:r>
+      <w:r>
+        <w:t xml:space="preserve">Domain </w:t>
+      </w:r>
+      <w:r>
+        <w:t>Comm</w:t>
       </w:r>
       <w:r>
         <w:t>.</w:t>
@@ -942,239 +936,222 @@
         <w:t>Astro 321: Intermed</w:t>
       </w:r>
       <w:r>
+        <w:t>iate</w:t>
+      </w:r>
+      <w:r>
+        <w:t xml:space="preserve"> Astro</w:t>
+      </w:r>
+      <w:r>
+        <w:t>dynami</w:t>
+      </w:r>
+      <w:r>
+        <w:t>cs</w:t>
+      </w:r>
+    </w:p>
+    <w:p>
+      <w:r>
+        <w:t>Instructed intermediate course in orbit mechanics</w:t>
+      </w:r>
+      <w:r>
+        <w:t xml:space="preserve"> including </w:t>
+      </w:r>
+      <w:r>
+        <w:t xml:space="preserve">orbit determination, maneuvers, perturbations, and rendezvous and proximity operations, as well as programming skills to perform these operations at scale. </w:t>
+      </w:r>
+    </w:p>
+    <w:p>
+      <w:pPr>
+        <w:pStyle w:val="Heading3"/>
+      </w:pPr>
+      <w:r>
+        <w:t>Course Director, Astro 310: Intr</w:t>
+      </w:r>
+      <w:r>
+        <w:t>o</w:t>
+      </w:r>
+      <w:r>
+        <w:t xml:space="preserve"> to Astro</w:t>
+      </w:r>
+      <w:r>
+        <w:t>nautical Engineering</w:t>
+      </w:r>
+    </w:p>
+    <w:p>
+      <w:r>
+        <w:t>Directed introductory astrodynamics</w:t>
+      </w:r>
+      <w:r>
+        <w:t xml:space="preserve"> course</w:t>
+      </w:r>
+      <w:r>
+        <w:t xml:space="preserve">, including orbital mechanics, spacecraft systems, and rocket propulsion. Required for all Air Force Academy cadets. </w:t>
+      </w:r>
+      <w:r>
+        <w:rPr>
+          <w:rFonts w:eastAsiaTheme="minorHAnsi"/>
+        </w:rPr>
+        <w:t>T</w:t>
+      </w:r>
+      <w:r>
+        <w:rPr>
+          <w:rFonts w:eastAsiaTheme="minorHAnsi"/>
+        </w:rPr>
+        <w:t>rained</w:t>
+      </w:r>
+      <w:r>
+        <w:rPr>
+          <w:rFonts w:eastAsiaTheme="minorHAnsi"/>
+        </w:rPr>
+        <w:t xml:space="preserve"> incoming</w:t>
+      </w:r>
+      <w:r>
+        <w:rPr>
+          <w:rFonts w:eastAsiaTheme="minorHAnsi"/>
+        </w:rPr>
+        <w:t xml:space="preserve"> faculty</w:t>
+      </w:r>
+      <w:r>
+        <w:rPr>
+          <w:rFonts w:eastAsiaTheme="minorHAnsi"/>
+        </w:rPr>
+        <w:t xml:space="preserve"> before their first teaching semester. </w:t>
+      </w:r>
+    </w:p>
+    <w:p>
+      <w:pPr>
+        <w:pStyle w:val="Heading3"/>
+      </w:pPr>
+      <w:r>
+        <w:t>Instructor, EM 320: Dynamics</w:t>
+      </w:r>
+    </w:p>
+    <w:p>
+      <w:r>
+        <w:t>Instructed introductory dynamics, covering k</w:t>
+      </w:r>
+      <w:r>
+        <w:t xml:space="preserve">inematic and kinetic analysis of particles and rigid bodies, as </w:t>
+      </w:r>
+      <w:r>
+        <w:t xml:space="preserve">well as an introduction to mechanical vibrations of simple systems. Required for all Aeronautical, Astronautical, and Mechanical Engineering Majors. </w:t>
+      </w:r>
+    </w:p>
+    <w:p>
+      <w:pPr>
+        <w:pStyle w:val="Heading3"/>
+      </w:pPr>
+      <w:r>
+        <w:t>Engineering Division Executive Officer</w:t>
+      </w:r>
+      <w:r>
+        <w:t>, 2013–2014</w:t>
+      </w:r>
+    </w:p>
+    <w:p>
+      <w:pPr>
+        <w:pStyle w:val="Heading1"/>
+      </w:pPr>
+      <w:r>
+        <w:t>Other Professional experience</w:t>
+      </w:r>
+    </w:p>
+    <w:p>
+      <w:pPr>
+        <w:pStyle w:val="Heading2"/>
+      </w:pPr>
+      <w:r>
+        <w:t>201</w:t>
+      </w:r>
+      <w:r>
+        <w:t>2</w:t>
+      </w:r>
+      <w:r>
+        <w:t xml:space="preserve">–2014 </w:t>
+      </w:r>
+      <w:r>
+        <w:tab/>
+      </w:r>
+      <w:r>
+        <w:t>SBIRS System Test Engineer, I</w:t>
+      </w:r>
+      <w:r>
+        <w:t>nfrared Space Systems Directorate</w:t>
+      </w:r>
+      <w:r>
+        <w:t xml:space="preserve">, </w:t>
+      </w:r>
+      <w:r>
+        <w:t>Los Angeles CA</w:t>
+      </w:r>
+    </w:p>
+    <w:p>
+      <w:r>
+        <w:t>O</w:t>
+      </w:r>
+      <w:r>
+        <w:t xml:space="preserve">versaw system test for SBIRS missile warning system, including pre- and post-launch checkouts for three </w:t>
+      </w:r>
+      <w:r>
+        <w:t>spacecraft</w:t>
+      </w:r>
+      <w:r>
+        <w:t xml:space="preserve">. </w:t>
+      </w:r>
+      <w:r>
+        <w:t>T</w:t>
+      </w:r>
+      <w:r>
+        <w:t xml:space="preserve">esting led to successful completion of a major in-place </w:t>
+      </w:r>
+      <w:r>
+        <w:t xml:space="preserve">ground system </w:t>
+      </w:r>
+      <w:r>
+        <w:t>upgrade with no downtime.</w:t>
+      </w:r>
+      <w:r>
+        <w:t xml:space="preserve"> </w:t>
+      </w:r>
+      <w:r>
+        <w:t>C</w:t>
+      </w:r>
+      <w:r>
+        <w:t xml:space="preserve">ompiled and edited biennial update to the </w:t>
+      </w:r>
+      <w:proofErr w:type="gramStart"/>
+      <w:r>
+        <w:t>Congressionally-mandated</w:t>
+      </w:r>
+      <w:proofErr w:type="gramEnd"/>
+      <w:r>
+        <w:t xml:space="preserve"> </w:t>
+      </w:r>
+      <w:r>
+        <w:t>Test and Evaluation Master Plan</w:t>
+      </w:r>
+      <w:r>
+        <w:t>, including coordination</w:t>
+      </w:r>
+      <w:r>
+        <w:t xml:space="preserve"> with external agencies for </w:t>
+      </w:r>
+      <w:r>
+        <w:t>OSD approval</w:t>
+      </w:r>
+      <w:r>
         <w:t>.</w:t>
       </w:r>
-      <w:r>
-        <w:t xml:space="preserve"> Astro</w:t>
-      </w:r>
-      <w:r>
-        <w:t>dynami</w:t>
-      </w:r>
-      <w:r>
-        <w:t>cs</w:t>
-      </w:r>
-    </w:p>
-    <w:p>
-      <w:r>
-        <w:t>Instructed intermediate course in orbit mechanics</w:t>
-      </w:r>
-      <w:r>
-        <w:t xml:space="preserve"> including </w:t>
-      </w:r>
-      <w:r>
-        <w:t xml:space="preserve">orbit determination, maneuvers, perturbations, and rendezvous and proximity operations, as well as programming skills to perform these operations at scale. </w:t>
-      </w:r>
-    </w:p>
-    <w:p>
-      <w:pPr>
-        <w:pStyle w:val="Heading3"/>
-      </w:pPr>
-      <w:r>
-        <w:t>Course Director, Astro 310: Intr</w:t>
-      </w:r>
-      <w:r>
-        <w:t>o</w:t>
-      </w:r>
-      <w:r>
-        <w:t xml:space="preserve"> to Astro</w:t>
-      </w:r>
-      <w:r>
-        <w:t>nautical Engineering</w:t>
-      </w:r>
-    </w:p>
-    <w:p>
-      <w:r>
-        <w:t>Directed introductory astrodynamics</w:t>
-      </w:r>
-      <w:r>
-        <w:t xml:space="preserve"> course</w:t>
-      </w:r>
-      <w:r>
-        <w:t xml:space="preserve">, including orbital mechanics, spacecraft systems, and rocket propulsion. Required for all Air Force Academy cadets. </w:t>
-      </w:r>
-      <w:r>
-        <w:rPr>
-          <w:rFonts w:eastAsiaTheme="minorHAnsi"/>
-        </w:rPr>
-        <w:t>T</w:t>
-      </w:r>
-      <w:r>
-        <w:rPr>
-          <w:rFonts w:eastAsiaTheme="minorHAnsi"/>
-        </w:rPr>
-        <w:t>rained</w:t>
-      </w:r>
-      <w:r>
-        <w:rPr>
-          <w:rFonts w:eastAsiaTheme="minorHAnsi"/>
-        </w:rPr>
-        <w:t xml:space="preserve"> incoming</w:t>
-      </w:r>
-      <w:r>
-        <w:rPr>
-          <w:rFonts w:eastAsiaTheme="minorHAnsi"/>
-        </w:rPr>
-        <w:t xml:space="preserve"> faculty</w:t>
-      </w:r>
-      <w:r>
-        <w:rPr>
-          <w:rFonts w:eastAsiaTheme="minorHAnsi"/>
-        </w:rPr>
-        <w:t xml:space="preserve"> before their first teaching semester. </w:t>
-      </w:r>
-    </w:p>
-    <w:p>
-      <w:pPr>
-        <w:pStyle w:val="Heading3"/>
-      </w:pPr>
-      <w:r>
-        <w:t>Instructor, EM 320: Dynamics</w:t>
-      </w:r>
-    </w:p>
-    <w:p>
-      <w:r>
-        <w:t>Instructed introductory dynamics, covering k</w:t>
-      </w:r>
-      <w:r>
-        <w:t xml:space="preserve">inematic and kinetic analysis of particles and rigid bodies, as </w:t>
-      </w:r>
-      <w:r>
-        <w:t xml:space="preserve">well as an introduction to mechanical vibrations of simple systems. Required for all Aeronautical, Astronautical, and Mechanical Engineering Majors. </w:t>
-      </w:r>
-    </w:p>
-    <w:p>
-      <w:pPr>
-        <w:pStyle w:val="Heading3"/>
-      </w:pPr>
-      <w:r>
-        <w:t>Engineering Division Executive Officer</w:t>
-      </w:r>
-    </w:p>
-    <w:p>
-      <w:pPr>
-        <w:pStyle w:val="Heading1"/>
-      </w:pPr>
-      <w:r>
-        <w:t>Other Professional experience</w:t>
-      </w:r>
     </w:p>
     <w:p>
       <w:pPr>
         <w:pStyle w:val="Heading2"/>
       </w:pPr>
       <w:r>
-        <w:t>201</w:t>
-      </w:r>
-      <w:r>
-        <w:t>2</w:t>
-      </w:r>
-      <w:r>
-        <w:t xml:space="preserve">–2014 </w:t>
+        <w:t xml:space="preserve">2011–2012 </w:t>
       </w:r>
       <w:r>
         <w:tab/>
-      </w:r>
-      <w:r>
-        <w:t>SBIRS System Test Engineer, I</w:t>
-      </w:r>
-      <w:r>
-        <w:t>nfrared Space Systems Directorate</w:t>
-      </w:r>
-      <w:r>
-        <w:t xml:space="preserve">, </w:t>
-      </w:r>
-      <w:r>
-        <w:t>Los Angeles CA</w:t>
-      </w:r>
-    </w:p>
-    <w:p>
-      <w:r>
-        <w:t>O</w:t>
-      </w:r>
-      <w:r>
-        <w:t xml:space="preserve">versaw system test for SBIRS missile warning system, including pre- and post-launch checkouts for three </w:t>
-      </w:r>
-      <w:r>
-        <w:t>spacecraft</w:t>
-      </w:r>
-      <w:r>
-        <w:t xml:space="preserve">. </w:t>
-      </w:r>
-      <w:r>
-        <w:t>T</w:t>
-      </w:r>
-      <w:r>
-        <w:t xml:space="preserve">esting led to successful completion of a major in-place </w:t>
-      </w:r>
-      <w:r>
-        <w:t xml:space="preserve">ground system </w:t>
-      </w:r>
-      <w:r>
-        <w:t>upgrade with no downtime.</w:t>
-      </w:r>
-      <w:r>
-        <w:t xml:space="preserve"> </w:t>
-      </w:r>
-      <w:r>
-        <w:t>C</w:t>
-      </w:r>
-      <w:r>
-        <w:t xml:space="preserve">ompiled and edited biennial update to the </w:t>
-      </w:r>
-      <w:proofErr w:type="gramStart"/>
-      <w:r>
-        <w:t>Congressionally-mandated</w:t>
-      </w:r>
-      <w:proofErr w:type="gramEnd"/>
-      <w:r>
-        <w:t xml:space="preserve"> </w:t>
-      </w:r>
-      <w:r>
-        <w:t>Test and Evaluation Master Plan</w:t>
-      </w:r>
-      <w:r>
-        <w:t>, including coordination</w:t>
-      </w:r>
-      <w:r>
-        <w:t xml:space="preserve"> with external agencies for </w:t>
-      </w:r>
-      <w:r>
-        <w:t xml:space="preserve">OSD </w:t>
-      </w:r>
-      <w:r>
-        <w:t>approval</w:t>
-      </w:r>
-      <w:r>
-        <w:t>.</w:t>
-      </w:r>
-    </w:p>
-    <w:p>
-      <w:pPr>
-        <w:pStyle w:val="Heading2"/>
-      </w:pPr>
-      <w:r>
-        <w:t>201</w:t>
-      </w:r>
-      <w:r>
-        <w:t>1</w:t>
-      </w:r>
-      <w:r>
-        <w:t>–201</w:t>
-      </w:r>
-      <w:r>
-        <w:t>2</w:t>
-      </w:r>
-      <w:r>
-        <w:t xml:space="preserve"> </w:t>
-      </w:r>
-      <w:r>
-        <w:tab/>
-      </w:r>
-      <w:r>
-        <w:t>DSP Orbital Operations Officer</w:t>
-      </w:r>
-      <w:r>
-        <w:t>, Infrared Space Systems Directorate, Los Angeles CA</w:t>
+        <w:t>DSP Orbital Operations Officer, Infrared Space Systems Directorate, Los Angeles CA</w:t>
       </w:r>
     </w:p>
     <w:p>
@@ -1666,7 +1643,19 @@
         <w:rPr>
           <w:rFonts w:eastAsia="Times New Roman"/>
         </w:rPr>
-        <w:t xml:space="preserve">Adamcik, Benjamin, et al. "Impact of storage time and operational temperature on deployable composite booms." </w:t>
+        <w:t xml:space="preserve">Adamcik, Benjamin, </w:t>
+      </w:r>
+      <w:r>
+        <w:rPr>
+          <w:rFonts w:eastAsia="Times New Roman"/>
+        </w:rPr>
+        <w:t xml:space="preserve">Jordan Firth, </w:t>
+      </w:r>
+      <w:r>
+        <w:rPr>
+          <w:rFonts w:eastAsia="Times New Roman"/>
+        </w:rPr>
+        <w:t xml:space="preserve">et al. "Impact of storage time and operational temperature on deployable composite booms." </w:t>
       </w:r>
       <w:r>
         <w:rPr>
@@ -1834,6 +1823,9 @@
       </w:r>
     </w:p>
     <w:p>
+      <w:pPr>
+        <w:spacing w:after="0"/>
+      </w:pPr>
       <w:r>
         <w:t>20</w:t>
       </w:r>
@@ -3429,23 +3421,6 @@
 </file>
 
 <file path=customXml/item1.xml><?xml version="1.0" encoding="utf-8"?>
-<p:properties xmlns:p="http://schemas.microsoft.com/office/2006/metadata/properties" xmlns:xsi="http://www.w3.org/2001/XMLSchema-instance" xmlns:pc="http://schemas.microsoft.com/office/infopath/2007/PartnerControls">
-  <documentManagement>
-    <_activity xmlns="eb22ea8b-83d8-4226-9182-8fa805d77e81" xsi:nil="true"/>
-  </documentManagement>
-</p:properties>
-</file>
-
-<file path=customXml/item2.xml><?xml version="1.0" encoding="utf-8"?>
-<?mso-contentType ?>
-<FormTemplates xmlns="http://schemas.microsoft.com/sharepoint/v3/contenttype/forms">
-  <Display>DocumentLibraryForm</Display>
-  <Edit>DocumentLibraryForm</Edit>
-  <New>DocumentLibraryForm</New>
-</FormTemplates>
-</file>
-
-<file path=customXml/item3.xml><?xml version="1.0" encoding="utf-8"?>
 <ct:contentTypeSchema xmlns:ct="http://schemas.microsoft.com/office/2006/metadata/contentType" xmlns:ma="http://schemas.microsoft.com/office/2006/metadata/properties/metaAttributes" ct:_="" ma:_="" ma:contentTypeName="Document" ma:contentTypeID="0x010100AF7A6BEBB77DCF4BB8B71D315A7691CB" ma:contentTypeVersion="15" ma:contentTypeDescription="Create a new document." ma:contentTypeScope="" ma:versionID="2df62e8b93004291d376fa6ea6326077">
   <xsd:schema xmlns:xsd="http://www.w3.org/2001/XMLSchema" xmlns:xs="http://www.w3.org/2001/XMLSchema" xmlns:p="http://schemas.microsoft.com/office/2006/metadata/properties" xmlns:ns3="eb22ea8b-83d8-4226-9182-8fa805d77e81" xmlns:ns4="bcd8512d-fbb8-41a1-bc8a-c7ee7257ceae" targetNamespace="http://schemas.microsoft.com/office/2006/metadata/properties" ma:root="true" ma:fieldsID="7f959103873dab13d0681bd1f8d568fd" ns3:_="" ns4:_="">
     <xsd:import namespace="eb22ea8b-83d8-4226-9182-8fa805d77e81"/>
@@ -3678,25 +3653,24 @@
 </ct:contentTypeSchema>
 </file>
 
-<file path=customXml/itemProps1.xml><?xml version="1.0" encoding="utf-8"?>
-<ds:datastoreItem xmlns:ds="http://schemas.openxmlformats.org/officeDocument/2006/customXml" ds:itemID="{2C623FF2-841E-44B2-A891-D4B8A1970E34}">
-  <ds:schemaRefs>
-    <ds:schemaRef ds:uri="http://schemas.microsoft.com/office/2006/metadata/properties"/>
-    <ds:schemaRef ds:uri="http://schemas.microsoft.com/office/infopath/2007/PartnerControls"/>
-    <ds:schemaRef ds:uri="eb22ea8b-83d8-4226-9182-8fa805d77e81"/>
-  </ds:schemaRefs>
-</ds:datastoreItem>
+<file path=customXml/item2.xml><?xml version="1.0" encoding="utf-8"?>
+<?mso-contentType ?>
+<FormTemplates xmlns="http://schemas.microsoft.com/sharepoint/v3/contenttype/forms">
+  <Display>DocumentLibraryForm</Display>
+  <Edit>DocumentLibraryForm</Edit>
+  <New>DocumentLibraryForm</New>
+</FormTemplates>
 </file>
 
-<file path=customXml/itemProps2.xml><?xml version="1.0" encoding="utf-8"?>
-<ds:datastoreItem xmlns:ds="http://schemas.openxmlformats.org/officeDocument/2006/customXml" ds:itemID="{048C7316-CDA8-49D1-91A4-EFFE91C62C18}">
-  <ds:schemaRefs>
-    <ds:schemaRef ds:uri="http://schemas.microsoft.com/sharepoint/v3/contenttype/forms"/>
-  </ds:schemaRefs>
-</ds:datastoreItem>
+<file path=customXml/item3.xml><?xml version="1.0" encoding="utf-8"?>
+<p:properties xmlns:p="http://schemas.microsoft.com/office/2006/metadata/properties" xmlns:xsi="http://www.w3.org/2001/XMLSchema-instance" xmlns:pc="http://schemas.microsoft.com/office/infopath/2007/PartnerControls">
+  <documentManagement>
+    <_activity xmlns="eb22ea8b-83d8-4226-9182-8fa805d77e81" xsi:nil="true"/>
+  </documentManagement>
+</p:properties>
 </file>
 
-<file path=customXml/itemProps3.xml><?xml version="1.0" encoding="utf-8"?>
+<file path=customXml/itemProps1.xml><?xml version="1.0" encoding="utf-8"?>
 <ds:datastoreItem xmlns:ds="http://schemas.openxmlformats.org/officeDocument/2006/customXml" ds:itemID="{243728EB-129E-4C4C-9349-C2737B4E1FDF}">
   <ds:schemaRefs>
     <ds:schemaRef ds:uri="http://schemas.microsoft.com/office/2006/metadata/contentType"/>
@@ -3713,4 +3687,22 @@
     <ds:schemaRef ds:uri="http://schemas.microsoft.com/internal/obd"/>
   </ds:schemaRefs>
 </ds:datastoreItem>
+</file>
+
+<file path=customXml/itemProps2.xml><?xml version="1.0" encoding="utf-8"?>
+<ds:datastoreItem xmlns:ds="http://schemas.openxmlformats.org/officeDocument/2006/customXml" ds:itemID="{048C7316-CDA8-49D1-91A4-EFFE91C62C18}">
+  <ds:schemaRefs>
+    <ds:schemaRef ds:uri="http://schemas.microsoft.com/sharepoint/v3/contenttype/forms"/>
+  </ds:schemaRefs>
+</ds:datastoreItem>
+</file>
+
+<file path=customXml/itemProps3.xml><?xml version="1.0" encoding="utf-8"?>
+<ds:datastoreItem xmlns:ds="http://schemas.openxmlformats.org/officeDocument/2006/customXml" ds:itemID="{2C623FF2-841E-44B2-A891-D4B8A1970E34}">
+  <ds:schemaRefs>
+    <ds:schemaRef ds:uri="http://schemas.microsoft.com/office/2006/metadata/properties"/>
+    <ds:schemaRef ds:uri="http://schemas.microsoft.com/office/infopath/2007/PartnerControls"/>
+    <ds:schemaRef ds:uri="eb22ea8b-83d8-4226-9182-8fa805d77e81"/>
+  </ds:schemaRefs>
+</ds:datastoreItem>
 </file>
</xml_diff>